<commit_message>
Document Twitter ingestion filter: original tweets only
Make the corpus filter explicit in three places (LIMITATIONS.md,
dataset/README.md, DOCX). The ingestion query appends -is:retweet
-is:reply, so the dataset contains only original tweets — engagement
counts are preserved but reply/RT content is not. Same filter applies
to both sim corpora and ground truth, so internal comparisons remain
consistent.

Co-Authored-By: Claude Opus 4.7 (1M context) <noreply@anthropic.com>
</commit_message>
<xml_diff>
--- a/backend/data/experiment_results/aggregate/Pulse_FinalProject.docx
+++ b/backend/data/experiment_results/aggregate/Pulse_FinalProject.docx
@@ -2222,6 +2222,14 @@
         <w:pStyle w:val="ListBullet"/>
       </w:pPr>
       <w:r>
+        <w:t>Original tweets only — replies, retweets, and quote tweets are excluded by the ingestion query. We preserve engagement counts (likes, retweets, replies, views) per tweet, but not the content of the replies or RTs. This is a significant blind spot: replies are often where the strongest sentiment lives, especially in outrage or pile-on cycles. The same filter applies to both sim corpora and ground truth, so internal comparison is consistent — but the absolute level of 'how Twitter feels' is biased toward original-tweet voice, which tends to be more measured than reply voice.</w:t>
+      </w:r>
+    </w:p>
+    <w:p>
+      <w:pPr>
+        <w:pStyle w:val="ListBullet"/>
+      </w:pPr>
+      <w:r>
         <w:t>Tests were chosen partly for high Twitter volume. The selection itself is biased toward 'tweet-able' events. Less tweet-genic events (e.g. local government decisions, niche product launches) may not be testable on Twitter at all.</w:t>
       </w:r>
     </w:p>

</xml_diff>